<commit_message>
adding infrastructure certificate and SDD of Work Item 1 Process
</commit_message>
<xml_diff>
--- a/BA Ascciocaite/PDD_Acme_Transction_31_8_2025_V1.0.1.docx
+++ b/BA Ascciocaite/PDD_Acme_Transction_31_8_2025_V1.0.1.docx
@@ -5108,7 +5108,7 @@
           <w:noProof/>
         </w:rPr>
         <w:drawing>
-          <wp:inline distT="0" distB="0" distL="0" distR="0" wp14:anchorId="55DF0830" wp14:editId="39C5C595">
+          <wp:inline distT="0" distB="0" distL="0" distR="0" wp14:anchorId="55DF0830" wp14:editId="3AA69CC8">
             <wp:extent cx="6645910" cy="1811655"/>
             <wp:effectExtent l="0" t="0" r="2540" b="0"/>
             <wp:docPr id="1050827322" name="Picture 2" descr="A screen shot of a computer&#10;&#10;AI-generated content may be incorrect."/>
@@ -7825,6 +7825,7 @@
             </w:pPr>
             <w:r>
               <w:rPr>
+                <w:noProof/>
                 <w:sz w:val="14"/>
                 <w:szCs w:val="14"/>
               </w:rPr>
@@ -8988,6 +8989,7 @@
             </w:pPr>
             <w:r>
               <w:rPr>
+                <w:noProof/>
                 <w:sz w:val="14"/>
                 <w:szCs w:val="14"/>
               </w:rPr>
@@ -9112,6 +9114,7 @@
             </w:pPr>
             <w:r>
               <w:rPr>
+                <w:noProof/>
                 <w:sz w:val="14"/>
                 <w:szCs w:val="14"/>
               </w:rPr>
@@ -9238,6 +9241,7 @@
             </w:pPr>
             <w:r>
               <w:rPr>
+                <w:noProof/>
                 <w:sz w:val="14"/>
                 <w:szCs w:val="14"/>
               </w:rPr>
@@ -10826,6 +10830,177 @@
           </w:p>
         </w:tc>
       </w:tr>
+      <w:tr>
+        <w:trPr>
+          <w:trHeight w:val="70"/>
+        </w:trPr>
+        <w:tc>
+          <w:tcPr>
+            <w:tcW w:w="2965" w:type="dxa"/>
+          </w:tcPr>
+          <w:p>
+            <w:pPr>
+              <w:rPr>
+                <w:sz w:val="14"/>
+                <w:szCs w:val="14"/>
+              </w:rPr>
+            </w:pPr>
+            <w:r>
+              <w:rPr>
+                <w:sz w:val="14"/>
+                <w:szCs w:val="14"/>
+              </w:rPr>
+              <w:t>#BE05 Data cant be extracted successfully or invalid</w:t>
+            </w:r>
+          </w:p>
+        </w:tc>
+        <w:tc>
+          <w:tcPr>
+            <w:tcW w:w="3512" w:type="dxa"/>
+          </w:tcPr>
+          <w:p>
+            <w:pPr>
+              <w:pStyle w:val="ListParagraph"/>
+              <w:ind w:left="0"/>
+              <w:jc w:val="center"/>
+              <w:rPr>
+                <w:sz w:val="14"/>
+                <w:szCs w:val="14"/>
+              </w:rPr>
+            </w:pPr>
+            <w:r>
+              <w:rPr>
+                <w:sz w:val="14"/>
+                <w:szCs w:val="14"/>
+              </w:rPr>
+              <w:t>If data cant be sent success fully</w:t>
+            </w:r>
+          </w:p>
+        </w:tc>
+        <w:tc>
+          <w:tcPr>
+            <w:tcW w:w="4048" w:type="dxa"/>
+          </w:tcPr>
+          <w:p>
+            <w:pPr>
+              <w:pStyle w:val="ListParagraph"/>
+              <w:ind w:left="0"/>
+              <w:jc w:val="center"/>
+              <w:rPr>
+                <w:sz w:val="14"/>
+                <w:szCs w:val="14"/>
+              </w:rPr>
+            </w:pPr>
+            <w:r>
+              <w:rPr>
+                <w:sz w:val="14"/>
+                <w:szCs w:val="14"/>
+              </w:rPr>
+              <w:t xml:space="preserve">Send Email To </w:t>
+            </w:r>
+            <w:r>
+              <w:rPr>
+                <w:sz w:val="14"/>
+                <w:szCs w:val="14"/>
+              </w:rPr>
+              <w:t>Director of Accounting</w:t>
+            </w:r>
+          </w:p>
+        </w:tc>
+      </w:tr>
+      <w:tr>
+        <w:trPr>
+          <w:trHeight w:val="70"/>
+        </w:trPr>
+        <w:tc>
+          <w:tcPr>
+            <w:tcW w:w="2965" w:type="dxa"/>
+          </w:tcPr>
+          <w:p>
+            <w:pPr>
+              <w:rPr>
+                <w:sz w:val="14"/>
+                <w:szCs w:val="14"/>
+              </w:rPr>
+            </w:pPr>
+            <w:r>
+              <w:rPr>
+                <w:sz w:val="14"/>
+                <w:szCs w:val="14"/>
+              </w:rPr>
+              <w:t>#BE06 Client Account cant be found</w:t>
+            </w:r>
+          </w:p>
+        </w:tc>
+        <w:tc>
+          <w:tcPr>
+            <w:tcW w:w="3512" w:type="dxa"/>
+          </w:tcPr>
+          <w:p>
+            <w:pPr>
+              <w:pStyle w:val="ListParagraph"/>
+              <w:ind w:left="0"/>
+              <w:jc w:val="center"/>
+              <w:rPr>
+                <w:sz w:val="14"/>
+                <w:szCs w:val="14"/>
+              </w:rPr>
+            </w:pPr>
+            <w:r>
+              <w:rPr>
+                <w:sz w:val="14"/>
+                <w:szCs w:val="14"/>
+              </w:rPr>
+              <w:t>If we search client Id or about client account number and cant be found</w:t>
+            </w:r>
+          </w:p>
+        </w:tc>
+        <w:tc>
+          <w:tcPr>
+            <w:tcW w:w="4048" w:type="dxa"/>
+          </w:tcPr>
+          <w:p>
+            <w:pPr>
+              <w:pStyle w:val="ListParagraph"/>
+              <w:ind w:left="0"/>
+              <w:jc w:val="center"/>
+              <w:rPr>
+                <w:sz w:val="14"/>
+                <w:szCs w:val="14"/>
+              </w:rPr>
+            </w:pPr>
+            <w:r>
+              <w:rPr>
+                <w:sz w:val="14"/>
+                <w:szCs w:val="14"/>
+              </w:rPr>
+              <w:t xml:space="preserve">Send Email To </w:t>
+            </w:r>
+            <w:r>
+              <w:rPr>
+                <w:sz w:val="14"/>
+                <w:szCs w:val="14"/>
+              </w:rPr>
+              <w:t>Director of Accounting</w:t>
+            </w:r>
+            <w:r>
+              <w:rPr>
+                <w:sz w:val="14"/>
+                <w:szCs w:val="14"/>
+              </w:rPr>
+              <w:br/>
+              <w:t xml:space="preserve">update Transaction as </w:t>
+            </w:r>
+            <w:r>
+              <w:rPr>
+                <w:sz w:val="14"/>
+                <w:szCs w:val="14"/>
+              </w:rPr>
+              <w:t>rejected</w:t>
+            </w:r>
+          </w:p>
+        </w:tc>
+      </w:tr>
     </w:tbl>
     <w:p>
       <w:pPr>
@@ -11186,21 +11361,7 @@
                 <w:sz w:val="14"/>
                 <w:szCs w:val="14"/>
               </w:rPr>
-              <w:t xml:space="preserve"> </w:t>
-            </w:r>
-            <w:r>
-              <w:rPr>
-                <w:sz w:val="14"/>
-                <w:szCs w:val="14"/>
-              </w:rPr>
-              <w:t>Retry 3 times if not opened</w:t>
-            </w:r>
-            <w:r>
-              <w:rPr>
-                <w:sz w:val="14"/>
-                <w:szCs w:val="14"/>
-              </w:rPr>
-              <w:t xml:space="preserve"> </w:t>
+              <w:t xml:space="preserve"> Retry 3 times if not opened </w:t>
             </w:r>
             <w:r>
               <w:rPr>
@@ -11256,7 +11417,6 @@
           <w:szCs w:val="28"/>
           <w:lang w:val="en"/>
         </w:rPr>
-        <w:lastRenderedPageBreak/>
         <w:t>N</w:t>
       </w:r>
       <w:r>

</xml_diff>